<commit_message>
Added the point of variation and justification for pattern
</commit_message>
<xml_diff>
--- a/Abstract-Factor&Adapter Abstractions.docx
+++ b/Abstract-Factor&Adapter Abstractions.docx
@@ -59,10 +59,19 @@
       </w:pPr>
       <w:r>
         <w:rPr>
-          <w:sz w:val="28"/>
-          <w:szCs w:val="28"/>
-        </w:rPr>
-        <w:t>TIVIDY must talk to external systems whose interfaces were not designed for it.</w:t>
+          <w:b/>
+          <w:bCs/>
+          <w:sz w:val="28"/>
+          <w:szCs w:val="28"/>
+        </w:rPr>
+        <w:t>Problem.</w:t>
+      </w:r>
+      <w:r>
+        <w:rPr>
+          <w:sz w:val="28"/>
+          <w:szCs w:val="28"/>
+        </w:rPr>
+        <w:t xml:space="preserve"> Work items in a workflow sometimes need an external system to do the work, such as a carrier, a payment provider or a records system. Each of these has its own interface that was not designed for TIVIDY, and we cannot modify it. If engine classes called these interfaces directly, the engine would contain system-specific code, and every new integration or vendor API change would mean editing the engine.</w:t>
       </w:r>
     </w:p>
     <w:p>
@@ -74,375 +83,193 @@
       </w:pPr>
       <w:r>
         <w:rPr>
-          <w:sz w:val="28"/>
-          <w:szCs w:val="28"/>
-        </w:rPr>
-        <w:t>Participants:</w:t>
+          <w:b/>
+          <w:bCs/>
+          <w:sz w:val="28"/>
+          <w:szCs w:val="28"/>
+        </w:rPr>
+        <w:t>Participants.</w:t>
       </w:r>
     </w:p>
     <w:p>
       <w:pPr>
-        <w:rPr>
-          <w:sz w:val="28"/>
-          <w:szCs w:val="28"/>
-          <w:lang w:val="en-GB"/>
-        </w:rPr>
-      </w:pPr>
-      <w:r>
-        <w:rPr>
-          <w:sz w:val="28"/>
-          <w:szCs w:val="28"/>
-        </w:rPr>
-        <w:tab/>
+        <w:numPr>
+          <w:ilvl w:val="0"/>
+          <w:numId w:val="1"/>
+        </w:numPr>
+        <w:rPr>
+          <w:sz w:val="28"/>
+          <w:szCs w:val="28"/>
+        </w:rPr>
+      </w:pPr>
+      <w:r>
+        <w:rPr>
+          <w:sz w:val="28"/>
+          <w:szCs w:val="28"/>
+        </w:rPr>
+        <w:t>Target: Connector, an abstract class owned by the engine, declaring the generic operations the engine uses to invoke any external system.</w:t>
       </w:r>
     </w:p>
-    <w:tbl>
-      <w:tblPr>
-        <w:tblW w:w="0" w:type="auto"/>
-        <w:tblCellSpacing w:w="15" w:type="dxa"/>
-        <w:tblCellMar>
-          <w:top w:w="15" w:type="dxa"/>
-          <w:left w:w="15" w:type="dxa"/>
-          <w:bottom w:w="15" w:type="dxa"/>
-          <w:right w:w="15" w:type="dxa"/>
-        </w:tblCellMar>
-        <w:tblLook w:val="04A0" w:firstRow="1" w:lastRow="0" w:firstColumn="1" w:lastColumn="0" w:noHBand="0" w:noVBand="1"/>
-      </w:tblPr>
-      <w:tblGrid>
-        <w:gridCol w:w="1141"/>
-        <w:gridCol w:w="3625"/>
-        <w:gridCol w:w="4260"/>
-      </w:tblGrid>
-      <w:tr>
-        <w:trPr>
-          <w:tblCellSpacing w:w="15" w:type="dxa"/>
-        </w:trPr>
-        <w:tc>
-          <w:tcPr>
-            <w:tcW w:w="0" w:type="auto"/>
-            <w:vAlign w:val="center"/>
-            <w:hideMark/>
-          </w:tcPr>
-          <w:p>
-            <w:pPr>
-              <w:rPr>
-                <w:sz w:val="28"/>
-                <w:szCs w:val="28"/>
-              </w:rPr>
-            </w:pPr>
-            <w:r>
-              <w:rPr>
-                <w:b/>
-                <w:bCs/>
-                <w:sz w:val="28"/>
-                <w:szCs w:val="28"/>
-              </w:rPr>
-              <w:t>Target</w:t>
-            </w:r>
-          </w:p>
-        </w:tc>
-        <w:tc>
-          <w:tcPr>
-            <w:tcW w:w="0" w:type="auto"/>
-            <w:vAlign w:val="center"/>
-            <w:hideMark/>
-          </w:tcPr>
-          <w:p>
-            <w:pPr>
-              <w:rPr>
-                <w:sz w:val="28"/>
-                <w:szCs w:val="28"/>
-              </w:rPr>
-            </w:pPr>
-            <w:r>
-              <w:rPr>
-                <w:sz w:val="28"/>
-                <w:szCs w:val="28"/>
-              </w:rPr>
-              <w:t>Connector (abstract)</w:t>
-            </w:r>
-          </w:p>
-        </w:tc>
-        <w:tc>
-          <w:tcPr>
-            <w:tcW w:w="0" w:type="auto"/>
-            <w:vAlign w:val="center"/>
-            <w:hideMark/>
-          </w:tcPr>
-          <w:p>
-            <w:pPr>
-              <w:rPr>
-                <w:sz w:val="28"/>
-                <w:szCs w:val="28"/>
-              </w:rPr>
-            </w:pPr>
-            <w:r>
-              <w:rPr>
-                <w:sz w:val="28"/>
-                <w:szCs w:val="28"/>
-              </w:rPr>
-              <w:t>Owned by the engine. Operations are generic, something like "send this request, get a result". No mention of post, payments or couriers.</w:t>
-            </w:r>
-          </w:p>
-        </w:tc>
-      </w:tr>
-      <w:tr>
-        <w:trPr>
-          <w:tblCellSpacing w:w="15" w:type="dxa"/>
-        </w:trPr>
-        <w:tc>
-          <w:tcPr>
-            <w:tcW w:w="0" w:type="auto"/>
-            <w:vAlign w:val="center"/>
-            <w:hideMark/>
-          </w:tcPr>
-          <w:p>
-            <w:pPr>
-              <w:rPr>
-                <w:sz w:val="28"/>
-                <w:szCs w:val="28"/>
-              </w:rPr>
-            </w:pPr>
-            <w:proofErr w:type="spellStart"/>
-            <w:r>
-              <w:rPr>
-                <w:b/>
-                <w:bCs/>
-                <w:sz w:val="28"/>
-                <w:szCs w:val="28"/>
-              </w:rPr>
-              <w:t>Adaptee</w:t>
-            </w:r>
-            <w:proofErr w:type="spellEnd"/>
-          </w:p>
-        </w:tc>
-        <w:tc>
-          <w:tcPr>
-            <w:tcW w:w="0" w:type="auto"/>
-            <w:vAlign w:val="center"/>
-            <w:hideMark/>
-          </w:tcPr>
-          <w:p>
-            <w:pPr>
-              <w:rPr>
-                <w:sz w:val="28"/>
-                <w:szCs w:val="28"/>
-              </w:rPr>
-            </w:pPr>
-            <w:r>
-              <w:rPr>
-                <w:sz w:val="28"/>
-                <w:szCs w:val="28"/>
-              </w:rPr>
-              <w:t xml:space="preserve">The external system's existing API, for example </w:t>
-            </w:r>
-            <w:proofErr w:type="spellStart"/>
-            <w:r>
-              <w:rPr>
-                <w:sz w:val="28"/>
-                <w:szCs w:val="28"/>
-              </w:rPr>
-              <w:t>PostalServiceAPI</w:t>
-            </w:r>
-            <w:proofErr w:type="spellEnd"/>
-          </w:p>
-        </w:tc>
-        <w:tc>
-          <w:tcPr>
-            <w:tcW w:w="0" w:type="auto"/>
-            <w:vAlign w:val="center"/>
-            <w:hideMark/>
-          </w:tcPr>
-          <w:p>
-            <w:pPr>
-              <w:rPr>
-                <w:sz w:val="28"/>
-                <w:szCs w:val="28"/>
-              </w:rPr>
-            </w:pPr>
-            <w:r>
-              <w:rPr>
-                <w:sz w:val="28"/>
-                <w:szCs w:val="28"/>
-              </w:rPr>
-              <w:t>Your postal service example is right. It has its own operations and data formats, and you can't edit it because it isn't yours.</w:t>
-            </w:r>
-          </w:p>
-        </w:tc>
-      </w:tr>
-      <w:tr>
-        <w:trPr>
-          <w:tblCellSpacing w:w="15" w:type="dxa"/>
-        </w:trPr>
-        <w:tc>
-          <w:tcPr>
-            <w:tcW w:w="0" w:type="auto"/>
-            <w:vAlign w:val="center"/>
-            <w:hideMark/>
-          </w:tcPr>
-          <w:p>
-            <w:pPr>
-              <w:rPr>
-                <w:sz w:val="28"/>
-                <w:szCs w:val="28"/>
-              </w:rPr>
-            </w:pPr>
-            <w:r>
-              <w:rPr>
-                <w:b/>
-                <w:bCs/>
-                <w:sz w:val="28"/>
-                <w:szCs w:val="28"/>
-              </w:rPr>
-              <w:t>Adapter</w:t>
-            </w:r>
-          </w:p>
-        </w:tc>
-        <w:tc>
-          <w:tcPr>
-            <w:tcW w:w="0" w:type="auto"/>
-            <w:vAlign w:val="center"/>
-            <w:hideMark/>
-          </w:tcPr>
-          <w:p>
-            <w:pPr>
-              <w:rPr>
-                <w:sz w:val="28"/>
-                <w:szCs w:val="28"/>
-              </w:rPr>
-            </w:pPr>
-            <w:proofErr w:type="spellStart"/>
-            <w:r>
-              <w:rPr>
-                <w:sz w:val="28"/>
-                <w:szCs w:val="28"/>
-              </w:rPr>
-              <w:t>PostalServiceConnector</w:t>
-            </w:r>
-            <w:proofErr w:type="spellEnd"/>
-          </w:p>
-        </w:tc>
-        <w:tc>
-          <w:tcPr>
-            <w:tcW w:w="0" w:type="auto"/>
-            <w:vAlign w:val="center"/>
-            <w:hideMark/>
-          </w:tcPr>
-          <w:p>
-            <w:pPr>
-              <w:rPr>
-                <w:sz w:val="28"/>
-                <w:szCs w:val="28"/>
-              </w:rPr>
-            </w:pPr>
-            <w:r>
-              <w:rPr>
-                <w:sz w:val="28"/>
-                <w:szCs w:val="28"/>
-              </w:rPr>
-              <w:t xml:space="preserve">Inherits from Connector, holds a </w:t>
-            </w:r>
-            <w:proofErr w:type="spellStart"/>
-            <w:r>
-              <w:rPr>
-                <w:sz w:val="28"/>
-                <w:szCs w:val="28"/>
-              </w:rPr>
-              <w:t>PostalServiceAPI</w:t>
-            </w:r>
-            <w:proofErr w:type="spellEnd"/>
-            <w:r>
-              <w:rPr>
-                <w:sz w:val="28"/>
-                <w:szCs w:val="28"/>
-              </w:rPr>
-              <w:t>, and translates each generic call into the postal service's calls.</w:t>
-            </w:r>
-          </w:p>
-        </w:tc>
-      </w:tr>
-      <w:tr>
-        <w:trPr>
-          <w:tblCellSpacing w:w="15" w:type="dxa"/>
-        </w:trPr>
-        <w:tc>
-          <w:tcPr>
-            <w:tcW w:w="0" w:type="auto"/>
-            <w:vAlign w:val="center"/>
-            <w:hideMark/>
-          </w:tcPr>
-          <w:p>
-            <w:pPr>
-              <w:rPr>
-                <w:sz w:val="28"/>
-                <w:szCs w:val="28"/>
-              </w:rPr>
-            </w:pPr>
-            <w:r>
-              <w:rPr>
-                <w:b/>
-                <w:bCs/>
-                <w:sz w:val="28"/>
-                <w:szCs w:val="28"/>
-              </w:rPr>
-              <w:t>Client</w:t>
-            </w:r>
-          </w:p>
-        </w:tc>
-        <w:tc>
-          <w:tcPr>
-            <w:tcW w:w="0" w:type="auto"/>
-            <w:vAlign w:val="center"/>
-            <w:hideMark/>
-          </w:tcPr>
-          <w:p>
-            <w:pPr>
-              <w:rPr>
-                <w:sz w:val="28"/>
-                <w:szCs w:val="28"/>
-              </w:rPr>
-            </w:pPr>
-            <w:r>
-              <w:rPr>
-                <w:sz w:val="28"/>
-                <w:szCs w:val="28"/>
-              </w:rPr>
-              <w:t>The part of the engine that invokes external systems</w:t>
-            </w:r>
-          </w:p>
-        </w:tc>
-        <w:tc>
-          <w:tcPr>
-            <w:tcW w:w="0" w:type="auto"/>
-            <w:vAlign w:val="center"/>
-            <w:hideMark/>
-          </w:tcPr>
-          <w:p>
-            <w:pPr>
-              <w:rPr>
-                <w:sz w:val="28"/>
-                <w:szCs w:val="28"/>
-              </w:rPr>
-            </w:pPr>
-            <w:r>
-              <w:rPr>
-                <w:sz w:val="28"/>
-                <w:szCs w:val="28"/>
-              </w:rPr>
-              <w:t>Your team's call. The likely candidate is whatever represents a work item performed by a system rather than a person. It must know only Connector.</w:t>
-            </w:r>
-          </w:p>
-        </w:tc>
-      </w:tr>
-    </w:tbl>
     <w:p>
       <w:pPr>
-        <w:rPr>
-          <w:sz w:val="28"/>
-          <w:szCs w:val="28"/>
-          <w:lang w:val="en-GB"/>
-        </w:rPr>
-      </w:pPr>
+        <w:numPr>
+          <w:ilvl w:val="0"/>
+          <w:numId w:val="1"/>
+        </w:numPr>
+        <w:rPr>
+          <w:sz w:val="28"/>
+          <w:szCs w:val="28"/>
+        </w:rPr>
+      </w:pPr>
+      <w:r>
+        <w:rPr>
+          <w:sz w:val="28"/>
+          <w:szCs w:val="28"/>
+        </w:rPr>
+        <w:t>Adaptee: the external system's existing interface, for example PostalServiceAPI.</w:t>
+      </w:r>
+    </w:p>
+    <w:p>
+      <w:pPr>
+        <w:numPr>
+          <w:ilvl w:val="0"/>
+          <w:numId w:val="1"/>
+        </w:numPr>
+        <w:rPr>
+          <w:sz w:val="28"/>
+          <w:szCs w:val="28"/>
+        </w:rPr>
+      </w:pPr>
+      <w:r>
+        <w:rPr>
+          <w:sz w:val="28"/>
+          <w:szCs w:val="28"/>
+        </w:rPr>
+        <w:t>Adapter: PostalServiceConnector, which inherits from Connector and holds a PostalServiceAPI.</w:t>
+      </w:r>
+    </w:p>
+    <w:p>
+      <w:pPr>
+        <w:numPr>
+          <w:ilvl w:val="0"/>
+          <w:numId w:val="1"/>
+        </w:numPr>
+        <w:rPr>
+          <w:sz w:val="28"/>
+          <w:szCs w:val="28"/>
+        </w:rPr>
+      </w:pPr>
+      <w:r>
+        <w:rPr>
+          <w:sz w:val="28"/>
+          <w:szCs w:val="28"/>
+        </w:rPr>
+        <w:t>Client: [the engine class that invokes external systems], which depends only on Connector.</w:t>
+      </w:r>
+    </w:p>
+    <w:p>
+      <w:pPr>
+        <w:rPr>
+          <w:sz w:val="28"/>
+          <w:szCs w:val="28"/>
+        </w:rPr>
+      </w:pPr>
+      <w:r>
+        <w:rPr>
+          <w:b/>
+          <w:bCs/>
+          <w:sz w:val="28"/>
+          <w:szCs w:val="28"/>
+        </w:rPr>
+        <w:t>Collaboration.</w:t>
+      </w:r>
+      <w:r>
+        <w:rPr>
+          <w:sz w:val="28"/>
+          <w:szCs w:val="28"/>
+        </w:rPr>
+        <w:t xml:space="preserve"> The client calls an operation on Connector. The adapter translates the request into the adaptee's operations and data format, calls the adaptee, translates the response back, and returns it. The client never knows which external system handled the call.</w:t>
+      </w:r>
+    </w:p>
+    <w:p>
+      <w:pPr>
+        <w:rPr>
+          <w:sz w:val="28"/>
+          <w:szCs w:val="28"/>
+        </w:rPr>
+      </w:pPr>
+      <w:r>
+        <w:rPr>
+          <w:b/>
+          <w:bCs/>
+          <w:sz w:val="28"/>
+          <w:szCs w:val="28"/>
+        </w:rPr>
+        <w:t>What varies.</w:t>
+      </w:r>
+      <w:r>
+        <w:rPr>
+          <w:sz w:val="28"/>
+          <w:szCs w:val="28"/>
+        </w:rPr>
+        <w:t xml:space="preserve"> The set of external systems and their interfaces </w:t>
+      </w:r>
+      <w:proofErr w:type="gramStart"/>
+      <w:r>
+        <w:rPr>
+          <w:sz w:val="28"/>
+          <w:szCs w:val="28"/>
+        </w:rPr>
+        <w:t>varies</w:t>
+      </w:r>
+      <w:proofErr w:type="gramEnd"/>
+      <w:r>
+        <w:rPr>
+          <w:sz w:val="28"/>
+          <w:szCs w:val="28"/>
+        </w:rPr>
+        <w:t xml:space="preserve"> between organisations and over time. The Connector interface and the engine code that calls it do not. A new integration is one new adapter class with no changes to the engine, and a vendor API change is confined to that vendor's adapter.</w:t>
+      </w:r>
+    </w:p>
+    <w:p>
+      <w:pPr>
+        <w:rPr>
+          <w:sz w:val="28"/>
+          <w:szCs w:val="28"/>
+        </w:rPr>
+      </w:pPr>
+      <w:r>
+        <w:rPr>
+          <w:b/>
+          <w:bCs/>
+          <w:sz w:val="28"/>
+          <w:szCs w:val="28"/>
+        </w:rPr>
+        <w:t>Why Adapter.</w:t>
+      </w:r>
+      <w:r>
+        <w:rPr>
+          <w:sz w:val="28"/>
+          <w:szCs w:val="28"/>
+        </w:rPr>
+        <w:t xml:space="preserve"> The mismatch is between an interface we own and existing interfaces we cannot change, which is the situation Adapter addresses. We use an object </w:t>
+      </w:r>
+      <w:proofErr w:type="gramStart"/>
+      <w:r>
+        <w:rPr>
+          <w:sz w:val="28"/>
+          <w:szCs w:val="28"/>
+        </w:rPr>
+        <w:t>adapter</w:t>
+      </w:r>
+      <w:proofErr w:type="gramEnd"/>
+      <w:r>
+        <w:rPr>
+          <w:sz w:val="28"/>
+          <w:szCs w:val="28"/>
+        </w:rPr>
+        <w:t xml:space="preserve"> so the adapter holds the adaptee rather than inheriting from it, which avoids multiple inheritance and makes ownership of the adaptee explicit.</w:t>
+      </w:r>
     </w:p>
     <w:p>
       <w:pPr>
@@ -461,6 +288,163 @@
     </w:sectPr>
   </w:body>
 </w:document>
+</file>
+
+<file path=word/numbering.xml><?xml version="1.0" encoding="utf-8"?>
+<w:numbering xmlns:wpc="http://schemas.microsoft.com/office/word/2010/wordprocessingCanvas" xmlns:cx="http://schemas.microsoft.com/office/drawing/2014/chartex" xmlns:cx1="http://schemas.microsoft.com/office/drawing/2015/9/8/chartex" xmlns:cx2="http://schemas.microsoft.com/office/drawing/2015/10/21/chartex" xmlns:cx3="http://schemas.microsoft.com/office/drawing/2016/5/9/chartex" xmlns:cx4="http://schemas.microsoft.com/office/drawing/2016/5/10/chartex" xmlns:cx5="http://schemas.microsoft.com/office/drawing/2016/5/11/chartex" xmlns:cx6="http://schemas.microsoft.com/office/drawing/2016/5/12/chartex" xmlns:cx7="http://schemas.microsoft.com/office/drawing/2016/5/13/chartex" xmlns:cx8="http://schemas.microsoft.com/office/drawing/2016/5/14/chartex" xmlns:mc="http://schemas.openxmlformats.org/markup-compatibility/2006" xmlns:aink="http://schemas.microsoft.com/office/drawing/2016/ink" xmlns:am3d="http://schemas.microsoft.com/office/drawing/2017/model3d" xmlns:o="urn:schemas-microsoft-com:office:office" xmlns:oel="http://schemas.microsoft.com/office/2019/extlst" xmlns:r="http://schemas.openxmlformats.org/officeDocument/2006/relationships" xmlns:m="http://schemas.openxmlformats.org/officeDocument/2006/math" xmlns:v="urn:schemas-microsoft-com:vml" xmlns:wp14="http://schemas.microsoft.com/office/word/2010/wordprocessingDrawing" xmlns:wp="http://schemas.openxmlformats.org/drawingml/2006/wordprocessingDrawing" xmlns:w10="urn:schemas-microsoft-com:office:word" xmlns:w="http://schemas.openxmlformats.org/wordprocessingml/2006/main" xmlns:w14="http://schemas.microsoft.com/office/word/2010/wordml" xmlns:w15="http://schemas.microsoft.com/office/word/2012/wordml" xmlns:w16cex="http://schemas.microsoft.com/office/word/2018/wordml/cex" xmlns:w16cid="http://schemas.microsoft.com/office/word/2016/wordml/cid" xmlns:w16="http://schemas.microsoft.com/office/word/2018/wordml" xmlns:w16du="http://schemas.microsoft.com/office/word/2023/wordml/word16du" xmlns:w16sdtdh="http://schemas.microsoft.com/office/word/2020/wordml/sdtdatahash" xmlns:w16sdtfl="http://schemas.microsoft.com/office/word/2024/wordml/sdtformatlock" xmlns:w16se="http://schemas.microsoft.com/office/word/2015/wordml/symex" xmlns:wpg="http://schemas.microsoft.com/office/word/2010/wordprocessingGroup" xmlns:wpi="http://schemas.microsoft.com/office/word/2010/wordprocessingInk" xmlns:wne="http://schemas.microsoft.com/office/word/2006/wordml" xmlns:wps="http://schemas.microsoft.com/office/word/2010/wordprocessingShape" mc:Ignorable="w14 w15 w16se w16cid w16 w16cex w16sdtdh w16sdtfl w16du wp14">
+  <w:abstractNum w:abstractNumId="0" w15:restartNumberingAfterBreak="0">
+    <w:nsid w:val="540D2E64"/>
+    <w:multiLevelType w:val="multilevel"/>
+    <w:tmpl w:val="DB48D3E2"/>
+    <w:lvl w:ilvl="0">
+      <w:start w:val="1"/>
+      <w:numFmt w:val="bullet"/>
+      <w:lvlText w:val=""/>
+      <w:lvlJc w:val="left"/>
+      <w:pPr>
+        <w:tabs>
+          <w:tab w:val="num" w:pos="720"/>
+        </w:tabs>
+        <w:ind w:left="720" w:hanging="360"/>
+      </w:pPr>
+      <w:rPr>
+        <w:rFonts w:ascii="Symbol" w:hAnsi="Symbol" w:hint="default"/>
+        <w:sz w:val="20"/>
+      </w:rPr>
+    </w:lvl>
+    <w:lvl w:ilvl="1" w:tentative="1">
+      <w:start w:val="1"/>
+      <w:numFmt w:val="bullet"/>
+      <w:lvlText w:val="o"/>
+      <w:lvlJc w:val="left"/>
+      <w:pPr>
+        <w:tabs>
+          <w:tab w:val="num" w:pos="1440"/>
+        </w:tabs>
+        <w:ind w:left="1440" w:hanging="360"/>
+      </w:pPr>
+      <w:rPr>
+        <w:rFonts w:ascii="Courier New" w:hAnsi="Courier New" w:hint="default"/>
+        <w:sz w:val="20"/>
+      </w:rPr>
+    </w:lvl>
+    <w:lvl w:ilvl="2" w:tentative="1">
+      <w:start w:val="1"/>
+      <w:numFmt w:val="bullet"/>
+      <w:lvlText w:val=""/>
+      <w:lvlJc w:val="left"/>
+      <w:pPr>
+        <w:tabs>
+          <w:tab w:val="num" w:pos="2160"/>
+        </w:tabs>
+        <w:ind w:left="2160" w:hanging="360"/>
+      </w:pPr>
+      <w:rPr>
+        <w:rFonts w:ascii="Wingdings" w:hAnsi="Wingdings" w:hint="default"/>
+        <w:sz w:val="20"/>
+      </w:rPr>
+    </w:lvl>
+    <w:lvl w:ilvl="3" w:tentative="1">
+      <w:start w:val="1"/>
+      <w:numFmt w:val="bullet"/>
+      <w:lvlText w:val=""/>
+      <w:lvlJc w:val="left"/>
+      <w:pPr>
+        <w:tabs>
+          <w:tab w:val="num" w:pos="2880"/>
+        </w:tabs>
+        <w:ind w:left="2880" w:hanging="360"/>
+      </w:pPr>
+      <w:rPr>
+        <w:rFonts w:ascii="Wingdings" w:hAnsi="Wingdings" w:hint="default"/>
+        <w:sz w:val="20"/>
+      </w:rPr>
+    </w:lvl>
+    <w:lvl w:ilvl="4" w:tentative="1">
+      <w:start w:val="1"/>
+      <w:numFmt w:val="bullet"/>
+      <w:lvlText w:val=""/>
+      <w:lvlJc w:val="left"/>
+      <w:pPr>
+        <w:tabs>
+          <w:tab w:val="num" w:pos="3600"/>
+        </w:tabs>
+        <w:ind w:left="3600" w:hanging="360"/>
+      </w:pPr>
+      <w:rPr>
+        <w:rFonts w:ascii="Wingdings" w:hAnsi="Wingdings" w:hint="default"/>
+        <w:sz w:val="20"/>
+      </w:rPr>
+    </w:lvl>
+    <w:lvl w:ilvl="5" w:tentative="1">
+      <w:start w:val="1"/>
+      <w:numFmt w:val="bullet"/>
+      <w:lvlText w:val=""/>
+      <w:lvlJc w:val="left"/>
+      <w:pPr>
+        <w:tabs>
+          <w:tab w:val="num" w:pos="4320"/>
+        </w:tabs>
+        <w:ind w:left="4320" w:hanging="360"/>
+      </w:pPr>
+      <w:rPr>
+        <w:rFonts w:ascii="Wingdings" w:hAnsi="Wingdings" w:hint="default"/>
+        <w:sz w:val="20"/>
+      </w:rPr>
+    </w:lvl>
+    <w:lvl w:ilvl="6" w:tentative="1">
+      <w:start w:val="1"/>
+      <w:numFmt w:val="bullet"/>
+      <w:lvlText w:val=""/>
+      <w:lvlJc w:val="left"/>
+      <w:pPr>
+        <w:tabs>
+          <w:tab w:val="num" w:pos="5040"/>
+        </w:tabs>
+        <w:ind w:left="5040" w:hanging="360"/>
+      </w:pPr>
+      <w:rPr>
+        <w:rFonts w:ascii="Wingdings" w:hAnsi="Wingdings" w:hint="default"/>
+        <w:sz w:val="20"/>
+      </w:rPr>
+    </w:lvl>
+    <w:lvl w:ilvl="7" w:tentative="1">
+      <w:start w:val="1"/>
+      <w:numFmt w:val="bullet"/>
+      <w:lvlText w:val=""/>
+      <w:lvlJc w:val="left"/>
+      <w:pPr>
+        <w:tabs>
+          <w:tab w:val="num" w:pos="5760"/>
+        </w:tabs>
+        <w:ind w:left="5760" w:hanging="360"/>
+      </w:pPr>
+      <w:rPr>
+        <w:rFonts w:ascii="Wingdings" w:hAnsi="Wingdings" w:hint="default"/>
+        <w:sz w:val="20"/>
+      </w:rPr>
+    </w:lvl>
+    <w:lvl w:ilvl="8" w:tentative="1">
+      <w:start w:val="1"/>
+      <w:numFmt w:val="bullet"/>
+      <w:lvlText w:val=""/>
+      <w:lvlJc w:val="left"/>
+      <w:pPr>
+        <w:tabs>
+          <w:tab w:val="num" w:pos="6480"/>
+        </w:tabs>
+        <w:ind w:left="6480" w:hanging="360"/>
+      </w:pPr>
+      <w:rPr>
+        <w:rFonts w:ascii="Wingdings" w:hAnsi="Wingdings" w:hint="default"/>
+        <w:sz w:val="20"/>
+      </w:rPr>
+    </w:lvl>
+  </w:abstractNum>
+  <w:num w:numId="1" w16cid:durableId="435639686">
+    <w:abstractNumId w:val="0"/>
+  </w:num>
+</w:numbering>
 </file>
 
 <file path=word/styles.xml><?xml version="1.0" encoding="utf-8"?>

</xml_diff>